<commit_message>
added editng cell values
</commit_message>
<xml_diff>
--- a/test.docx
+++ b/test.docx
@@ -19,11 +19,7 @@
       </w:pPr>
       <w:r>
         <w:rPr/>
-        <w:t xml:space="preserve">I LOVE </w:t>
-      </w:r>
-      <w:r>
-        <w:rPr/>
-        <w:t>ghzl</w:t>
+        <w:t>I LOVE ghzl</w:t>
       </w:r>
     </w:p>
     <w:p>
@@ -34,6 +30,280 @@
       <w:r>
         <w:rPr/>
         <w:t>VERY MUCH</w:t>
+      </w:r>
+    </w:p>
+    <w:p>
+      <w:pPr>
+        <w:pStyle w:val="Normal"/>
+        <w:rPr/>
+      </w:pPr>
+      <w:r>
+        <w:rPr/>
+      </w:r>
+    </w:p>
+    <w:tbl>
+      <w:tblPr>
+        <w:tblW w:w="5000" w:type="pct"/>
+        <w:jc w:val="start"/>
+        <w:tblInd w:w="-5" w:type="dxa"/>
+        <w:tblLayout w:type="fixed"/>
+        <w:tblCellMar>
+          <w:top w:w="55" w:type="dxa"/>
+          <w:start w:w="55" w:type="dxa"/>
+          <w:bottom w:w="55" w:type="dxa"/>
+          <w:end w:w="55" w:type="dxa"/>
+        </w:tblCellMar>
+      </w:tblPr>
+      <w:tblGrid>
+        <w:gridCol w:w="3120"/>
+        <w:gridCol w:w="3120"/>
+        <w:gridCol w:w="3120"/>
+      </w:tblGrid>
+      <w:tr>
+        <w:trPr/>
+        <w:tc>
+          <w:tcPr>
+            <w:tcW w:w="3120" w:type="dxa"/>
+            <w:tcBorders>
+              <w:top w:val="single" w:sz="4" w:space="0" w:color="000000"/>
+              <w:start w:val="single" w:sz="4" w:space="0" w:color="000000"/>
+              <w:bottom w:val="single" w:sz="4" w:space="0" w:color="000000"/>
+            </w:tcBorders>
+          </w:tcPr>
+          <w:p>
+            <w:pPr>
+              <w:pStyle w:val="TableContents"/>
+              <w:rPr/>
+            </w:pPr>
+            <w:r>
+              <w:rPr/>
+              <w:t>NEWCELL</w:t>
+            </w:r>
+          </w:p>
+        </w:tc>
+        <w:tc>
+          <w:tcPr>
+            <w:tcW w:w="3120" w:type="dxa"/>
+            <w:tcBorders>
+              <w:top w:val="single" w:sz="4" w:space="0" w:color="000000"/>
+              <w:start w:val="single" w:sz="4" w:space="0" w:color="000000"/>
+              <w:bottom w:val="single" w:sz="4" w:space="0" w:color="000000"/>
+            </w:tcBorders>
+          </w:tcPr>
+          <w:p>
+            <w:pPr>
+              <w:pStyle w:val="TableContents"/>
+              <w:rPr/>
+            </w:pPr>
+            <w:r>
+              <w:rPr/>
+            </w:r>
+          </w:p>
+        </w:tc>
+        <w:tc>
+          <w:tcPr>
+            <w:tcW w:w="3120" w:type="dxa"/>
+            <w:tcBorders>
+              <w:top w:val="single" w:sz="4" w:space="0" w:color="000000"/>
+              <w:start w:val="single" w:sz="4" w:space="0" w:color="000000"/>
+              <w:bottom w:val="single" w:sz="4" w:space="0" w:color="000000"/>
+              <w:end w:val="single" w:sz="4" w:space="0" w:color="000000"/>
+            </w:tcBorders>
+          </w:tcPr>
+          <w:p>
+            <w:pPr>
+              <w:pStyle w:val="TableContents"/>
+              <w:rPr/>
+            </w:pPr>
+            <w:r>
+              <w:rPr/>
+            </w:r>
+          </w:p>
+        </w:tc>
+      </w:tr>
+      <w:tr>
+        <w:trPr/>
+        <w:tc>
+          <w:tcPr>
+            <w:tcW w:w="3120" w:type="dxa"/>
+            <w:tcBorders>
+              <w:start w:val="single" w:sz="4" w:space="0" w:color="000000"/>
+              <w:bottom w:val="single" w:sz="4" w:space="0" w:color="000000"/>
+            </w:tcBorders>
+          </w:tcPr>
+          <w:p>
+            <w:pPr>
+              <w:pStyle w:val="TableContents"/>
+              <w:rPr/>
+            </w:pPr>
+            <w:r>
+              <w:rPr/>
+            </w:r>
+          </w:p>
+        </w:tc>
+        <w:tc>
+          <w:tcPr>
+            <w:tcW w:w="3120" w:type="dxa"/>
+            <w:tcBorders>
+              <w:start w:val="single" w:sz="4" w:space="0" w:color="000000"/>
+              <w:bottom w:val="single" w:sz="4" w:space="0" w:color="000000"/>
+            </w:tcBorders>
+          </w:tcPr>
+          <w:p>
+            <w:pPr>
+              <w:pStyle w:val="TableContents"/>
+              <w:rPr/>
+            </w:pPr>
+            <w:r>
+              <w:rPr/>
+              <w:t>CELL2</w:t>
+            </w:r>
+          </w:p>
+        </w:tc>
+        <w:tc>
+          <w:tcPr>
+            <w:tcW w:w="3120" w:type="dxa"/>
+            <w:tcBorders>
+              <w:start w:val="single" w:sz="4" w:space="0" w:color="000000"/>
+              <w:bottom w:val="single" w:sz="4" w:space="0" w:color="000000"/>
+              <w:end w:val="single" w:sz="4" w:space="0" w:color="000000"/>
+            </w:tcBorders>
+          </w:tcPr>
+          <w:p>
+            <w:pPr>
+              <w:pStyle w:val="TableContents"/>
+              <w:rPr/>
+            </w:pPr>
+            <w:r>
+              <w:rPr/>
+            </w:r>
+          </w:p>
+        </w:tc>
+      </w:tr>
+      <w:tr>
+        <w:trPr/>
+        <w:tc>
+          <w:tcPr>
+            <w:tcW w:w="3120" w:type="dxa"/>
+            <w:tcBorders>
+              <w:start w:val="single" w:sz="4" w:space="0" w:color="000000"/>
+              <w:bottom w:val="single" w:sz="4" w:space="0" w:color="000000"/>
+            </w:tcBorders>
+          </w:tcPr>
+          <w:p>
+            <w:pPr>
+              <w:pStyle w:val="TableContents"/>
+              <w:rPr/>
+            </w:pPr>
+            <w:r>
+              <w:rPr/>
+            </w:r>
+          </w:p>
+        </w:tc>
+        <w:tc>
+          <w:tcPr>
+            <w:tcW w:w="3120" w:type="dxa"/>
+            <w:tcBorders>
+              <w:start w:val="single" w:sz="4" w:space="0" w:color="000000"/>
+              <w:bottom w:val="single" w:sz="4" w:space="0" w:color="000000"/>
+            </w:tcBorders>
+          </w:tcPr>
+          <w:p>
+            <w:pPr>
+              <w:pStyle w:val="TableContents"/>
+              <w:rPr/>
+            </w:pPr>
+            <w:r>
+              <w:rPr/>
+            </w:r>
+          </w:p>
+        </w:tc>
+        <w:tc>
+          <w:tcPr>
+            <w:tcW w:w="3120" w:type="dxa"/>
+            <w:tcBorders>
+              <w:start w:val="single" w:sz="4" w:space="0" w:color="000000"/>
+              <w:bottom w:val="single" w:sz="4" w:space="0" w:color="000000"/>
+              <w:end w:val="single" w:sz="4" w:space="0" w:color="000000"/>
+            </w:tcBorders>
+          </w:tcPr>
+          <w:p>
+            <w:pPr>
+              <w:pStyle w:val="TableContents"/>
+              <w:rPr/>
+            </w:pPr>
+            <w:r>
+              <w:rPr/>
+            </w:r>
+          </w:p>
+        </w:tc>
+      </w:tr>
+      <w:tr>
+        <w:trPr/>
+        <w:tc>
+          <w:tcPr>
+            <w:tcW w:w="3120" w:type="dxa"/>
+            <w:tcBorders>
+              <w:start w:val="single" w:sz="4" w:space="0" w:color="000000"/>
+              <w:bottom w:val="single" w:sz="4" w:space="0" w:color="000000"/>
+            </w:tcBorders>
+          </w:tcPr>
+          <w:p>
+            <w:pPr>
+              <w:pStyle w:val="TableContents"/>
+              <w:rPr/>
+            </w:pPr>
+            <w:r>
+              <w:rPr/>
+            </w:r>
+          </w:p>
+        </w:tc>
+        <w:tc>
+          <w:tcPr>
+            <w:tcW w:w="3120" w:type="dxa"/>
+            <w:tcBorders>
+              <w:start w:val="single" w:sz="4" w:space="0" w:color="000000"/>
+              <w:bottom w:val="single" w:sz="4" w:space="0" w:color="000000"/>
+            </w:tcBorders>
+          </w:tcPr>
+          <w:p>
+            <w:pPr>
+              <w:pStyle w:val="TableContents"/>
+              <w:rPr/>
+            </w:pPr>
+            <w:r>
+              <w:rPr/>
+            </w:r>
+          </w:p>
+        </w:tc>
+        <w:tc>
+          <w:tcPr>
+            <w:tcW w:w="3120" w:type="dxa"/>
+            <w:tcBorders>
+              <w:start w:val="single" w:sz="4" w:space="0" w:color="000000"/>
+              <w:bottom w:val="single" w:sz="4" w:space="0" w:color="000000"/>
+              <w:end w:val="single" w:sz="4" w:space="0" w:color="000000"/>
+            </w:tcBorders>
+          </w:tcPr>
+          <w:p>
+            <w:pPr>
+              <w:pStyle w:val="TableContents"/>
+              <w:rPr/>
+            </w:pPr>
+            <w:r>
+              <w:rPr/>
+            </w:r>
+          </w:p>
+        </w:tc>
+      </w:tr>
+    </w:tbl>
+    <w:p>
+      <w:pPr>
+        <w:pStyle w:val="Normal"/>
+        <w:rPr/>
+      </w:pPr>
+      <w:r>
+        <w:rPr/>
       </w:r>
     </w:p>
     <w:sectPr>
@@ -143,6 +413,16 @@
     <w:rPr>
       <w:rFonts w:cs="FreeSans"/>
     </w:rPr>
+  </w:style>
+  <w:style w:type="paragraph" w:styleId="TableContents">
+    <w:name w:val="Table Contents"/>
+    <w:basedOn w:val="Normal"/>
+    <w:qFormat/>
+    <w:pPr>
+      <w:widowControl w:val="false"/>
+      <w:suppressLineNumbers/>
+    </w:pPr>
+    <w:rPr/>
   </w:style>
 </w:styles>
 </file>

</xml_diff>